<commit_message>
Executive Capstone Report: add Financial Methodology section
Adds a new section, 'Financial Methodology -- What Is Measured vs. What
Is Assumed', right after the Financial Impact section and before
Governance & Honest Exclusions. Explains -- point by point, matching
the report's existing style -- that the raw Kaggle dataset has no
revenue/exposure/loss-recovery columns, that every dollar figure is
therefore (real, measured model outputs) x (explicitly labeled,
traceable ASSUMPTION unit values), and specifically how Problem 13's
revenue proxy is built from the dataset's own real Spend (S_) columns.
No new figures introduced -- text only, sourced from the platform's own
already-existing financial_assumptions.json files and Notebook 8's
documented EAD/LGD rationale. Validated (docx schema + paragraph-count
diff) and visually verified via a rendered PDF before committing.
</commit_message>
<xml_diff>
--- a/Executive_Capstone_Report/AMEX_RiskIQ_Platform_Executive_Capstone_Report.docx
+++ b/Executive_Capstone_Report/AMEX_RiskIQ_Platform_Executive_Capstone_Report.docx
@@ -2632,6 +2632,102 @@
         <w:rPr>
           <w:color w:val="0B1F3A"/>
         </w:rPr>
+        <w:t>Financial Methodology -- What Is Measured vs. What Is Assumed</w:t>
+      </w:r>
+    </w:p>
+    <w:p>
+      <w:r>
+        <w:t xml:space="preserve">The Kaggle American Express Default Prediction dataset this entire platform is built on is deliberately anonymized: it contains no revenue, credit-limit, exposure, or loss-recovery columns, by the competition's own design. Every dollar figure in this report is therefore built from two clearly separated ingredients, and this platform never blends the two without saying which is which.</w:t>
+      </w:r>
+    </w:p>
+    <w:p>
+      <w:pPr>
+        <w:pStyle w:val="ListBullet"/>
+      </w:pPr>
+      <w:r>
+        <w:rPr>
+          <w:b/>
+        </w:rPr>
+        <w:t xml:space="preserve">Measured, from the real data: </w:t>
+      </w:r>
+      <w:r>
+        <w:t xml:space="preserve">every predicted default probability, population count, and true/false-positive and true/false-negative outcome count in this report is computed live by that problem's own trained model against real, held-out customers -- fully reproducible by re-running the platform's own notebooks against the same dataset.</w:t>
+      </w:r>
+    </w:p>
+    <w:p>
+      <w:pPr>
+        <w:pStyle w:val="ListBullet"/>
+      </w:pPr>
+      <w:r>
+        <w:rPr>
+          <w:b/>
+        </w:rPr>
+        <w:t xml:space="preserve">Assumed, where the dataset has no ground truth: </w:t>
+      </w:r>
+      <w:r>
+        <w:t xml:space="preserve">exposure-at-default, loss-given-default, revenue-per-account, and every treatment cost used in a net-benefit calculation are explicitly labeled ASSUMPTION values, sourced from commonly-cited unsecured-retail credit industry benchmarks -- never invented silently and never presented as if the dataset itself provided them.</w:t>
+      </w:r>
+    </w:p>
+    <w:p>
+      <w:pPr>
+        <w:pStyle w:val="ListBullet"/>
+      </w:pPr>
+      <w:r>
+        <w:rPr>
+          <w:b/>
+        </w:rPr>
+        <w:t xml:space="preserve">Every net-benefit figure is the product of the two: </w:t>
+      </w:r>
+      <w:r>
+        <w:t xml:space="preserve">real population counts and real model outcomes, multiplied by assumption-labeled dollar values per outcome. No dollar total anywhere in this report is read directly from a data column, because no such column exists in the raw dataset.</w:t>
+      </w:r>
+    </w:p>
+    <w:p>
+      <w:pPr>
+        <w:pStyle w:val="ListBullet"/>
+      </w:pPr>
+      <w:r>
+        <w:rPr>
+          <w:b/>
+        </w:rPr>
+        <w:t xml:space="preserve">Full traceability, not a hidden constant: </w:t>
+      </w:r>
+      <w:r>
+        <w:t xml:space="preserve">all 10 of this platform's financial_assumptions.json files -- one per value-creation problem -- log the exact value, its source, and a documented rationale for every assumption used, each explicitly marked “edit to your institution's actual figures.”</w:t>
+      </w:r>
+    </w:p>
+    <w:p>
+      <w:pPr>
+        <w:pStyle w:val="ListBullet"/>
+      </w:pPr>
+      <w:r>
+        <w:rPr>
+          <w:b/>
+        </w:rPr>
+        <w:t xml:space="preserve">The revenue proxy, specifically (Problem 13): </w:t>
+      </w:r>
+      <w:r>
+        <w:t xml:space="preserve">built from the dataset's own real “S_” (Spend) feature columns -- real and genuinely present, though anonymized -- converted into a real per-customer spend percentile rank, then scaled by an assumption-labeled average revenue figure. Reported explicitly as a revenue proxy, never as audited revenue.</w:t>
+      </w:r>
+    </w:p>
+    <w:p>
+      <w:r>
+        <w:t xml:space="preserve">What this means for the $429,926,252.73 total: it is a transparent, fully-documented methodology applied to real model outputs and stated financial assumptions -- not a number American Express, or any institution, has realized. Every assumption is designed to be replaced with an institution's own real unit economics to produce that institution's own real total.</w:t>
+      </w:r>
+    </w:p>
+    <w:p>
+      <w:r>
+        <w:br w:type="page"/>
+      </w:r>
+    </w:p>
+    <w:p>
+      <w:pPr>
+        <w:pStyle w:val="Heading1"/>
+      </w:pPr>
+      <w:r>
+        <w:rPr>
+          <w:color w:val="0B1F3A"/>
+        </w:rPr>
         <w:t>Governance &amp; Honest Exclusions</w:t>
       </w:r>
     </w:p>

</xml_diff>